<commit_message>
Supply Chain Disruption Crew: ERP, n8n approvals, knowledge base, hardening
- Versioned migrations V001-V005 (ports FK, action lifecycle state machine, dead-letter queue, approval ladder with
  timeouts and escalation, notification routes), pooled DB roles (read-only, audit, migrate)
- n8n workflows generated from reviewable JS: intake, approval decision, escalation tick with Gmail routing, error handler
- Policy checks, CrewAI guardrails, SOP-SC-015 and clauses 4.5/4.7 executed from the ERP
- Clause-level RAG over structured clauses.jsonl, KB lint, one-command bootstrap, live chaos checks, setup guide

Co-Authored-By: Claude Sonnet 5.5 <noreply@anthropic.com>
</commit_message>
<xml_diff>
--- a/knowledge_base/source/SOP-SC-014_Supply_Disruption_Response.docx
+++ b/knowledge_base/source/SOP-SC-014_Supply_Disruption_Response.docx
@@ -20,7 +20,7 @@
     </w:p>
     <w:p>
       <w:r>
-        <w:t>Owner: Head of Supply Chain Management · Version: 3.2 · Applies to: Manesar plant, all direct-material categories.</w:t>
+        <w:t>Owner: Head of Supply Chain Management · Version: 3.2 · Applies to: Manesar plant, all direct-material categories. Effective: 2026-10-01 · Supersedes: none.</w:t>
       </w:r>
     </w:p>
     <w:p>
@@ -258,6 +258,11 @@
       </w:r>
     </w:p>
     <w:p>
+      <w:r>
+        <w:t>2.3 An event is confirmed only when two independent sources report it. An unconfirmed event is classed L1 and no RFQ is raised.</w:t>
+      </w:r>
+    </w:p>
+    <w:p>
       <w:pPr>
         <w:pStyle w:val="Heading3"/>
       </w:pPr>
@@ -292,7 +297,7 @@
     </w:p>
     <w:p>
       <w:r>
-        <w:t>3.6 Parts whose days of cover exceed projected delay + 5 days are placed on L1 watch; no RFQ is raised.</w:t>
+        <w:t>3.6 Parts whose days of cover are equal to or above projected delay + 5 days are placed on part watch status (not an event severity); no RFQ is raised.</w:t>
       </w:r>
     </w:p>
     <w:p>
@@ -310,7 +315,7 @@
     </w:p>
     <w:p>
       <w:r>
-        <w:t>4.1 Expedited freight: Air freight may be authorised for critical parts when the freight premium is below 15% of the affected PO value.</w:t>
+        <w:t>4.1 Expedited freight: Air freight may be authorised for critical parts when the freight premium is below 15% of the affected PO value. The premium is taken from the carrier quote supplied by the buyer; if no quote is available, record freight quote required and do not estimate.</w:t>
       </w:r>
     </w:p>
     <w:p>
@@ -330,12 +335,17 @@
     </w:p>
     <w:p>
       <w:r>
-        <w:t>4.5 Production protection: If projected stock-out falls within 7 days, Production Planning must be notified to re-sequence builds toward models not using the affected part.</w:t>
+        <w:t>4.5 Production protection: If projected stock-out falls within 7 days, Production Planning must be notified to re-sequence builds toward models not using the affected part. Notification is also required when the projected stock-out falls before the earliest backup supplier can deliver (clause 4.7).</w:t>
       </w:r>
     </w:p>
     <w:p>
       <w:r>
         <w:t>4.6 Capacity shortfall: If a backup supplier's monthly capacity is below the RFQ quantity, the buyer must combine the RFQ with measures 4.1 or 4.3 for the balance.</w:t>
+      </w:r>
+    </w:p>
+    <w:p>
+      <w:r>
+        <w:t>4.7 Lead time check: If a backup supplier's standard lead time is longer than the part's days of cover, the RFQ must be combined with measure 4.1, and the action record must state the expected stock-out gap in days (lead time minus days of cover).</w:t>
       </w:r>
     </w:p>
     <w:p>

</xml_diff>